<commit_message>
fix(lecons): corrige deux références de la leçon stoïcisme n°11
- « L'obstacle à l'action fait avancer l'action » : Méditations V, 20
  et non IV, 1 (vérifié sur le texte intégral, traduction Long).
- La dichotomie du contrôle est posée en leçon 1, non en leçon 2.

Corrections fondues dans le texte, formulation d'origine conservée
dans un journal des corrections en fin de document. Fiche mise à jour.

Co-Authored-By: Claude Opus 5 <noreply@anthropic.com>
</commit_message>
<xml_diff>
--- a/livrables/lecons/2026-08-20_lecon-stoicisme_11_adversite-deuil-colere-peur-echec.docx
+++ b/livrables/lecons/2026-08-20_lecon-stoicisme_11_adversite-deuil-colere-peur-echec.docx
@@ -215,7 +215,7 @@
           <w:sz w:val="22"/>
           <w:szCs w:val="22"/>
         </w:rPr>
-        <w:t xml:space="preserve">La souffrance n'est pas dans l'événement lui-même, mais dans le jugement que nous portons sur lui. C'est ce principe — fondamental depuis la leçon 2 sur la dichotomie du contrôle — qui structure toute l'approche de l'adversité.</w:t>
+        <w:t xml:space="preserve">La souffrance n'est pas dans l'événement lui-même, mais dans le jugement que nous portons sur lui. C'est ce principe — fondamental depuis la leçon 1 sur la dichotomie du contrôle — qui structure toute l'approche de l'adversité.</w:t>
       </w:r>
     </w:p>
     <w:p>
@@ -508,7 +508,7 @@
           <w:sz w:val="22"/>
           <w:szCs w:val="22"/>
         </w:rPr>
-        <w:t xml:space="preserve">Marc Aurèle formule ce principe dans ses Méditations (IV, 1) — principe repris par Ryan Holiday sous le nom d'« obstacle is the way » :</w:t>
+        <w:t xml:space="preserve">Marc Aurèle formule ce principe dans ses Méditations (V, 20) — principe repris par Ryan Holiday sous le nom d'« obstacle is the way » :</w:t>
       </w:r>
     </w:p>
     <w:p>
@@ -533,7 +533,7 @@
           <w:sz w:val="20"/>
           <w:szCs w:val="20"/>
         </w:rPr>
-        <w:t xml:space="preserve">  — Marc Aurèle, Méditations, IV, 1 (synthèse, non citation verbatim)</w:t>
+        <w:t xml:space="preserve">  — Marc Aurèle, Méditations, V, 20 (synthèse, non citation verbatim)</w:t>
       </w:r>
     </w:p>
     <w:p>
@@ -2704,6 +2704,134 @@
           <w:szCs w:val="22"/>
         </w:rPr>
         <w:t xml:space="preserve">Musonius Rufus, souvent appelé « le Socrate romain », est le maître d'Épictète. Contrairement aux traités abstraits, ses Diatribes sont ancrées dans la vie concrète : alimentation, mariage, travail, discipline du corps. La leçon explorera comment le stoïcisme se pratique — littéralement — au quotidien, et pourquoi Musonius considérait que philosopher sans agir en conséquence n'était qu'un exercice vain.</w:t>
+      </w:r>
+    </w:p>
+    <w:p>
+      <w:pPr>
+        <w:spacing w:after="160" w:before="160"/>
+        <w:jc w:val="center"/>
+      </w:pPr>
+      <w:r>
+        <w:rPr>
+          <w:rFonts w:ascii="Times New Roman" w:cs="Times New Roman" w:eastAsia="Times New Roman" w:hAnsi="Times New Roman"/>
+          <w:color w:val="BBBBBB"/>
+          <w:sz w:val="18"/>
+          <w:szCs w:val="18"/>
+        </w:rPr>
+        <w:t xml:space="preserve">─────────────────────────────────────────</w:t>
+      </w:r>
+    </w:p>
+    <w:p>
+      <w:pPr>
+        <w:pStyle w:val="Heading2"/>
+        <w:spacing w:after="160" w:before="360"/>
+      </w:pPr>
+      <w:r>
+        <w:rPr>
+          <w:rFonts w:ascii="Times New Roman" w:cs="Times New Roman" w:eastAsia="Times New Roman" w:hAnsi="Times New Roman"/>
+          <w:b/>
+          <w:bCs/>
+          <w:color w:val="1B3A6B"/>
+          <w:sz w:val="30"/>
+          <w:szCs w:val="30"/>
+        </w:rPr>
+        <w:t xml:space="preserve">📝 Journal des corrections</w:t>
+      </w:r>
+    </w:p>
+    <w:p>
+      <w:pPr>
+        <w:spacing w:after="80" w:before="80"/>
+      </w:pPr>
+      <w:r>
+        <w:rPr>
+          <w:rFonts w:ascii="Times New Roman" w:cs="Times New Roman" w:eastAsia="Times New Roman" w:hAnsi="Times New Roman"/>
+          <w:b w:val="false"/>
+          <w:bCs w:val="false"/>
+          <w:color w:val="1F2937"/>
+          <w:sz w:val="22"/>
+          <w:szCs w:val="22"/>
+        </w:rPr>
+        <w:t xml:space="preserve">Cette leçon a été produite et relue le 20/08/2026. Les deux corrections sont fondues dans le texte ci-dessus ; la formulation d'origine est conservée ici, pour que rien ne se perde entre les deux versions.</w:t>
+      </w:r>
+    </w:p>
+    <w:p>
+      <w:pPr>
+        <w:spacing w:after="80" w:before="80"/>
+      </w:pPr>
+      <w:r>
+        <w:rPr>
+          <w:rFonts w:ascii="Times New Roman" w:cs="Times New Roman" w:eastAsia="Times New Roman" w:hAnsi="Times New Roman"/>
+          <w:b w:val="false"/>
+          <w:bCs w:val="false"/>
+          <w:color w:val="1F2937"/>
+          <w:sz w:val="22"/>
+          <w:szCs w:val="22"/>
+        </w:rPr>
+        <w:t xml:space="preserve">1. Référence de la citation de Marc Aurèle.</w:t>
+      </w:r>
+    </w:p>
+    <w:p>
+      <w:pPr>
+        <w:spacing w:after="80" w:before="80"/>
+      </w:pPr>
+      <w:r>
+        <w:rPr>
+          <w:rFonts w:ascii="Times New Roman" w:cs="Times New Roman" w:eastAsia="Times New Roman" w:hAnsi="Times New Roman"/>
+          <w:b w:val="false"/>
+          <w:bCs w:val="false"/>
+          <w:color w:val="1F2937"/>
+          <w:sz w:val="22"/>
+          <w:szCs w:val="22"/>
+        </w:rPr>
+        <w:t xml:space="preserve">Version initiale : « ses Méditations (IV, 1) », puis « — Marc Aurèle, Méditations, IV, 1 ». La formule citée — « L'obstacle à l'action fait avancer l'action. Ce qui se dresse en travers du chemin devient le chemin » — se trouve en Méditations V, 20, et non IV, 1. Vérifié le 20/08/2026 sur le texte intégral (traduction Long, MIT Classics) : le livre IV contient bien l'image voisine du feu qui convertit ce qu'on y jette, ce qui explique la confusion, mais la formulation reprise ici est celle du livre V — c'est aussi la référence que retient Ryan Holiday. Corrigé aux deux endroits.</w:t>
+      </w:r>
+    </w:p>
+    <w:p>
+      <w:pPr>
+        <w:spacing w:after="80" w:before="80"/>
+      </w:pPr>
+      <w:r>
+        <w:rPr>
+          <w:rFonts w:ascii="Times New Roman" w:cs="Times New Roman" w:eastAsia="Times New Roman" w:hAnsi="Times New Roman"/>
+          <w:b w:val="false"/>
+          <w:bCs w:val="false"/>
+          <w:color w:val="1F2937"/>
+          <w:sz w:val="22"/>
+          <w:szCs w:val="22"/>
+        </w:rPr>
+        <w:t xml:space="preserve">2. Numéro de la leçon posant la dichotomie du contrôle.</w:t>
+      </w:r>
+    </w:p>
+    <w:p>
+      <w:pPr>
+        <w:spacing w:after="80" w:before="80"/>
+      </w:pPr>
+      <w:r>
+        <w:rPr>
+          <w:rFonts w:ascii="Times New Roman" w:cs="Times New Roman" w:eastAsia="Times New Roman" w:hAnsi="Times New Roman"/>
+          <w:b w:val="false"/>
+          <w:bCs w:val="false"/>
+          <w:color w:val="1F2937"/>
+          <w:sz w:val="22"/>
+          <w:szCs w:val="22"/>
+        </w:rPr>
+        <w:t xml:space="preserve">Version initiale : « fondamental depuis la leçon 2 sur la dichotomie du contrôle ». La dichotomie du contrôle est l'objet de la leçon 1 (05/06/2026) ; la leçon 2 l'élargit au cadre des trois disciplines d'Épictète, où elle devient le cœur de la discipline du désir. Corrigé en « leçon 1 ».</w:t>
+      </w:r>
+    </w:p>
+    <w:p>
+      <w:pPr>
+        <w:spacing w:after="80" w:before="80"/>
+      </w:pPr>
+      <w:r>
+        <w:rPr>
+          <w:rFonts w:ascii="Times New Roman" w:cs="Times New Roman" w:eastAsia="Times New Roman" w:hAnsi="Times New Roman"/>
+          <w:b w:val="false"/>
+          <w:bCs w:val="false"/>
+          <w:color w:val="1F2937"/>
+          <w:sz w:val="22"/>
+          <w:szCs w:val="22"/>
+        </w:rPr>
+        <w:t xml:space="preserve">Vérifié lors de la relecture et inchangé : les six paragraphes de l'Enchiridion mobilisés (§5 les jugements plutôt que les choses, §11 la restitution, §20 l'offense qui vient de l'opinion, §21 la mort et l'exil sous les yeux, §26, §42 celui qui nuit agit selon sa propre vision du devoir), contrôlés le 20/08/2026 sur le texte intégral MIT Classics ; l'attribution du De Ira à Sénèque ; la distinction pathē / eupatheiai et les trois eupatheiai citées (chara, boulêsis, eulabeia). Les citations restent présentées comme des synthèses et non des verbatim : la précaution est maintenue.</w:t>
       </w:r>
     </w:p>
     <w:p>

</xml_diff>